<commit_message>
ACDR2026: announce next ACDR in Sendai in closing remarks
Co-Authored-By: Claude Fable 5.1 <noreply@anthropic.com>
Claude-Session: https://claude.ai/code/session_01BHBsW6jxyH2X7L51FtZqxc
</commit_message>
<xml_diff>
--- a/reports/acdr2026_staff_deployment/進行シナリオ_0929/ACDR2026_Closing_Remarks_MIURA_案0929.docx
+++ b/reports/acdr2026_staff_deployment/進行シナリオ_0929/ACDR2026_Closing_Remarks_MIURA_案0929.docx
@@ -55,7 +55,7 @@
         <w:rPr>
           <w:b w:val="0"/>
         </w:rPr>
-        <w:t>アジア防災センターは、この2日間の成果を、センチネルアジアやGLIDEをはじめとする加盟国との協力事業に活かしてまいります。本会議のサマリーは、後日、参加者の皆さまと共有いたします。【次回のアジア防災会議については、（開催地・時期）を予定しています。】</w:t>
+        <w:t>アジア防災センターは、この2日間の成果を、センチネルアジアやGLIDEをはじめとする加盟国との協力事業に活かしてまいります。本会議のサマリーは、後日、参加者の皆さまと共有いたします。そして、次回のアジア防災会議は、仙台防災枠組の名を冠する都市、仙台市で開催する予定です【時期: 要確認】。本日ご参加の仙台市の皆さまとともに、皆さまを仙台でお迎えできることを楽しみにしています。</w:t>
       </w:r>
     </w:p>
     <w:p>
@@ -134,7 +134,7 @@
         <w:rPr>
           <w:b w:val="0"/>
         </w:rPr>
-        <w:t>The Asian Disaster Reduction Center will carry the outcomes of these two days into its cooperation with member countries, including Sentinel Asia and GLIDE. The summary of the conference will be shared with all participants. [The next Asian Conference on Disaster Reduction is planned to be held in (place), in (month/year).]</w:t>
+        <w:t>The Asian Disaster Reduction Center will carry the outcomes of these two days into its cooperation with member countries, including Sentinel Asia and GLIDE. The summary of the conference will be shared with all participants. I am also pleased to announce that the next Asian Conference on Disaster Reduction will be held in Sendai, Japan, the city that gave its name to the Sendai Framework [timing to be confirmed]. Together with our colleagues from the City of Sendai who are with us today, we look forward to welcoming you there.</w:t>
       </w:r>
     </w:p>
     <w:p>

</xml_diff>

<commit_message>
ACDR2026: next ACDR back to back with APMCDRR in Sendai
Co-Authored-By: Claude Fable 5.1 <noreply@anthropic.com>
Claude-Session: https://claude.ai/code/session_01BHBsW6jxyH2X7L51FtZqxc
</commit_message>
<xml_diff>
--- a/reports/acdr2026_staff_deployment/進行シナリオ_0929/ACDR2026_Closing_Remarks_MIURA_案0929.docx
+++ b/reports/acdr2026_staff_deployment/進行シナリオ_0929/ACDR2026_Closing_Remarks_MIURA_案0929.docx
@@ -55,7 +55,7 @@
         <w:rPr>
           <w:b w:val="0"/>
         </w:rPr>
-        <w:t>アジア防災センターは、この2日間の成果を、センチネルアジアやGLIDEをはじめとする加盟国との協力事業に活かしてまいります。本会議のサマリーは、後日、参加者の皆さまと共有いたします。そして、次回のアジア防災会議は、仙台防災枠組の名を冠する都市、仙台市で開催する予定です【時期: 要確認】。本日ご参加の仙台市の皆さまとともに、皆さまを仙台でお迎えできることを楽しみにしています。</w:t>
+        <w:t>アジア防災センターは、この2日間の成果を、センチネルアジアやGLIDEをはじめとする加盟国との協力事業に活かしてまいります。本会議のサマリーは、後日、参加者の皆さまと共有いたします。そして、次回のアジア防災会議は、仙台防災枠組の名を冠する都市、仙台市で、アジア太平洋防災閣僚級会議（APMCDRR）と連続して開催する予定です【時期: 要確認】。本日ご参加の仙台市の皆さまとともに、皆さまを仙台でお迎えできることを楽しみにしています。</w:t>
       </w:r>
     </w:p>
     <w:p>
@@ -134,7 +134,7 @@
         <w:rPr>
           <w:b w:val="0"/>
         </w:rPr>
-        <w:t>The Asian Disaster Reduction Center will carry the outcomes of these two days into its cooperation with member countries, including Sentinel Asia and GLIDE. The summary of the conference will be shared with all participants. I am also pleased to announce that the next Asian Conference on Disaster Reduction will be held in Sendai, Japan, the city that gave its name to the Sendai Framework [timing to be confirmed]. Together with our colleagues from the City of Sendai who are with us today, we look forward to welcoming you there.</w:t>
+        <w:t>The Asian Disaster Reduction Center will carry the outcomes of these two days into its cooperation with member countries, including Sentinel Asia and GLIDE. The summary of the conference will be shared with all participants. I am also pleased to announce that the next Asian Conference on Disaster Reduction will be held in Sendai, Japan, the city that gave its name to the Sendai Framework, back to back with the Asia-Pacific Ministerial Conference on Disaster Risk Reduction, APMCDRR [timing to be confirmed]. Together with our colleagues from the City of Sendai who are with us today, we look forward to welcoming you there.</w:t>
       </w:r>
     </w:p>
     <w:p>

</xml_diff>

<commit_message>
ACDR2026: next ACDR in Sendai, October 2027
Co-Authored-By: Claude Fable 5.1 <noreply@anthropic.com>
Claude-Session: https://claude.ai/code/session_01BHBsW6jxyH2X7L51FtZqxc
</commit_message>
<xml_diff>
--- a/reports/acdr2026_staff_deployment/進行シナリオ_0929/ACDR2026_Closing_Remarks_MIURA_案0929.docx
+++ b/reports/acdr2026_staff_deployment/進行シナリオ_0929/ACDR2026_Closing_Remarks_MIURA_案0929.docx
@@ -55,7 +55,7 @@
         <w:rPr>
           <w:b w:val="0"/>
         </w:rPr>
-        <w:t>アジア防災センターは、この2日間の成果を、センチネルアジアやGLIDEをはじめとする加盟国との協力事業に活かしてまいります。本会議のサマリーは、後日、参加者の皆さまと共有いたします。そして、次回のアジア防災会議は、仙台防災枠組の名を冠する都市、仙台市で、アジア太平洋防災閣僚級会議（APMCDRR）と連続して開催する予定です【時期: 要確認】。本日ご参加の仙台市の皆さまとともに、皆さまを仙台でお迎えできることを楽しみにしています。</w:t>
+        <w:t>アジア防災センターは、この2日間の成果を、センチネルアジアやGLIDEをはじめとする加盟国との協力事業に活かしてまいります。本会議のサマリーは、後日、参加者の皆さまと共有いたします。そして、次回のアジア防災会議は、仙台防災枠組の名を冠する都市、仙台市で、来年2027年10月に、アジア太平洋防災閣僚級会議（APMCDRR）と連続して開催する予定です。本日ご参加の仙台市の皆さまとともに、皆さまを仙台でお迎えできることを楽しみにしています。</w:t>
       </w:r>
     </w:p>
     <w:p>
@@ -134,7 +134,7 @@
         <w:rPr>
           <w:b w:val="0"/>
         </w:rPr>
-        <w:t>The Asian Disaster Reduction Center will carry the outcomes of these two days into its cooperation with member countries, including Sentinel Asia and GLIDE. The summary of the conference will be shared with all participants. I am also pleased to announce that the next Asian Conference on Disaster Reduction will be held in Sendai, Japan, the city that gave its name to the Sendai Framework, back to back with the Asia-Pacific Ministerial Conference on Disaster Risk Reduction, APMCDRR [timing to be confirmed]. Together with our colleagues from the City of Sendai who are with us today, we look forward to welcoming you there.</w:t>
+        <w:t>The Asian Disaster Reduction Center will carry the outcomes of these two days into its cooperation with member countries, including Sentinel Asia and GLIDE. The summary of the conference will be shared with all participants. I am also pleased to announce that the next Asian Conference on Disaster Reduction will be held in Sendai, Japan, the city that gave its name to the Sendai Framework, in October next year, 2027, back to back with the Asia-Pacific Ministerial Conference on Disaster Risk Reduction, APMCDRR. Together with our colleagues from the City of Sendai who are with us today, we look forward to welcoming you there.</w:t>
       </w:r>
     </w:p>
     <w:p>

</xml_diff>